<commit_message>
submitted to ICES JMS
</commit_message>
<xml_diff>
--- a/Docs/Archive/CoverLetter_Machine learning applied to otolith timeseries data to discriminate river of origin for Western Alaska Salmon.docx
+++ b/Docs/Archive/CoverLetter_Machine learning applied to otolith timeseries data to discriminate river of origin for Western Alaska Salmon.docx
@@ -25,7 +25,7 @@
           <w:sz w:val="22"/>
           <w:szCs w:val="22"/>
         </w:rPr>
-        <w:t xml:space="preserve">Dear </w:t>
+        <w:t xml:space="preserve">To whom it may concern </w:t>
       </w:r>
       <w:r>
         <w:rPr>
@@ -33,193 +33,107 @@
           <w:sz w:val="22"/>
           <w:szCs w:val="22"/>
         </w:rPr>
-        <w:t>Dr. Corley</w:t>
-      </w:r>
-      <w:r>
-        <w:rPr>
-          <w:rFonts w:ascii="Times New Roman" w:hAnsi="Times New Roman" w:cs="Times New Roman"/>
-          <w:sz w:val="22"/>
-          <w:szCs w:val="22"/>
-        </w:rPr>
         <w:t xml:space="preserve">, </w:t>
       </w:r>
     </w:p>
     <w:p>
       <w:pPr>
-        <w:rPr>
-          <w:rFonts w:ascii="Times New Roman" w:hAnsi="Times New Roman" w:cs="Times New Roman"/>
-          <w:sz w:val="22"/>
-          <w:szCs w:val="22"/>
-        </w:rPr>
-      </w:pPr>
-    </w:p>
-    <w:p>
-      <w:pPr>
-        <w:spacing w:line="240" w:lineRule="auto"/>
-        <w:rPr>
-          <w:rFonts w:ascii="Times New Roman" w:hAnsi="Times New Roman" w:cs="Times New Roman"/>
-          <w:sz w:val="22"/>
-          <w:szCs w:val="22"/>
-        </w:rPr>
-      </w:pPr>
-      <w:r>
-        <w:rPr>
-          <w:rFonts w:ascii="Times New Roman" w:hAnsi="Times New Roman" w:cs="Times New Roman"/>
-          <w:sz w:val="22"/>
-          <w:szCs w:val="22"/>
-        </w:rPr>
-        <w:tab/>
-      </w:r>
-      <w:r>
-        <w:rPr>
-          <w:rFonts w:ascii="Times New Roman" w:hAnsi="Times New Roman" w:cs="Times New Roman"/>
-          <w:color w:val="000000" w:themeColor="text1"/>
-          <w:sz w:val="22"/>
-          <w:szCs w:val="22"/>
-        </w:rPr>
-        <w:t xml:space="preserve">We would like to submit our manuscript titled </w:t>
-      </w:r>
-      <w:r>
-        <w:rPr>
-          <w:rStyle w:val="Strong"/>
-          <w:rFonts w:ascii="Times New Roman" w:hAnsi="Times New Roman" w:cs="Times New Roman"/>
-          <w:b w:val="0"/>
-          <w:bCs w:val="0"/>
-          <w:i/>
-          <w:iCs/>
-          <w:color w:val="000000" w:themeColor="text1"/>
-          <w:sz w:val="22"/>
-          <w:szCs w:val="22"/>
-        </w:rPr>
-        <w:t>“Machine Learning Applied to Otolith Microchemical Data to Discriminate Stock of Origin in Salmon.”</w:t>
-      </w:r>
-      <w:r>
-        <w:rPr>
-          <w:rFonts w:ascii="Times New Roman" w:hAnsi="Times New Roman" w:cs="Times New Roman"/>
-          <w:color w:val="000000" w:themeColor="text1"/>
-          <w:sz w:val="22"/>
-          <w:szCs w:val="22"/>
+        <w:pStyle w:val="isselectedend"/>
+        <w:rPr>
+          <w:sz w:val="20"/>
+          <w:szCs w:val="20"/>
+        </w:rPr>
+      </w:pPr>
+      <w:r>
+        <w:rPr>
+          <w:sz w:val="20"/>
+          <w:szCs w:val="20"/>
+        </w:rPr>
+        <w:t>W</w:t>
+      </w:r>
+      <w:r>
+        <w:rPr>
+          <w:sz w:val="20"/>
+          <w:szCs w:val="20"/>
+        </w:rPr>
+        <w:t xml:space="preserve">e are pleased to submit our manuscript entitled </w:t>
+      </w:r>
+      <w:r>
+        <w:rPr>
+          <w:rStyle w:val="Emphasis"/>
+          <w:rFonts w:eastAsiaTheme="majorEastAsia"/>
+          <w:sz w:val="20"/>
+          <w:szCs w:val="20"/>
+        </w:rPr>
+        <w:t>“Machine Learning Applied to Otolith Microchemical Data to Discriminate Stock of Origin in Salmon”</w:t>
+      </w:r>
+      <w:r>
+        <w:rPr>
+          <w:sz w:val="20"/>
+          <w:szCs w:val="20"/>
+        </w:rPr>
+        <w:t xml:space="preserve"> for consideration in the </w:t>
+      </w:r>
+      <w:r>
+        <w:rPr>
+          <w:rStyle w:val="Emphasis"/>
+          <w:rFonts w:eastAsiaTheme="majorEastAsia"/>
+          <w:sz w:val="20"/>
+          <w:szCs w:val="20"/>
+        </w:rPr>
+        <w:t>ICES Journal of Marine Science</w:t>
+      </w:r>
+      <w:r>
+        <w:rPr>
+          <w:sz w:val="20"/>
+          <w:szCs w:val="20"/>
+        </w:rPr>
+        <w:t>. This manuscript presents original research that applies machine learning approaches to otolith microchemical data to address an issue of direct relevance to fisheries management in marine environments.</w:t>
+      </w:r>
+      <w:r>
+        <w:rPr>
+          <w:sz w:val="20"/>
+          <w:szCs w:val="20"/>
         </w:rPr>
         <w:t xml:space="preserve"> </w:t>
       </w:r>
       <w:r>
         <w:rPr>
-          <w:rFonts w:ascii="Times New Roman" w:hAnsi="Times New Roman" w:cs="Times New Roman"/>
-          <w:color w:val="000000" w:themeColor="text1"/>
-          <w:sz w:val="22"/>
-          <w:szCs w:val="22"/>
-        </w:rPr>
-        <w:t xml:space="preserve">for consideration in Ecological Applications. This original research </w:t>
-      </w:r>
-      <w:r>
-        <w:rPr>
-          <w:rFonts w:ascii="Times New Roman" w:hAnsi="Times New Roman" w:cs="Times New Roman"/>
-          <w:color w:val="000000" w:themeColor="text1"/>
-          <w:sz w:val="22"/>
-          <w:szCs w:val="22"/>
-        </w:rPr>
-        <w:t xml:space="preserve">presents a novel approach </w:t>
-      </w:r>
-      <w:r>
-        <w:rPr>
-          <w:rFonts w:ascii="Times New Roman" w:hAnsi="Times New Roman" w:cs="Times New Roman"/>
-          <w:color w:val="000000" w:themeColor="text1"/>
-          <w:sz w:val="22"/>
-          <w:szCs w:val="22"/>
-        </w:rPr>
-        <w:t>to use microchemical data to explore spatial ecology at refined spatial scales</w:t>
-      </w:r>
-      <w:r>
-        <w:rPr>
-          <w:rFonts w:ascii="Times New Roman" w:hAnsi="Times New Roman" w:cs="Times New Roman"/>
-          <w:color w:val="000000" w:themeColor="text1"/>
-          <w:sz w:val="22"/>
-          <w:szCs w:val="22"/>
-        </w:rPr>
-        <w:t xml:space="preserve">, </w:t>
-      </w:r>
-      <w:r>
-        <w:rPr>
-          <w:rFonts w:ascii="Times New Roman" w:hAnsi="Times New Roman" w:cs="Times New Roman"/>
-          <w:color w:val="000000" w:themeColor="text1"/>
-          <w:sz w:val="22"/>
-          <w:szCs w:val="22"/>
-        </w:rPr>
-        <w:t xml:space="preserve">thereby allowing for a direct incorporation of multi-scale ecological dynamics into management decisions. We demonstrate the direct impact of these methods to decision making and management of pacific salmon in western Alaska, however, </w:t>
-      </w:r>
-      <w:r>
-        <w:rPr>
-          <w:rFonts w:ascii="Times New Roman" w:hAnsi="Times New Roman" w:cs="Times New Roman"/>
-          <w:color w:val="000000" w:themeColor="text1"/>
-          <w:sz w:val="22"/>
-          <w:szCs w:val="22"/>
-        </w:rPr>
-        <w:t>the methods presented here are broadly applicable to many systems and applications which use chemical signatures for movement</w:t>
-      </w:r>
-      <w:r>
-        <w:rPr>
-          <w:rFonts w:ascii="Times New Roman" w:hAnsi="Times New Roman" w:cs="Times New Roman"/>
-          <w:color w:val="000000" w:themeColor="text1"/>
-          <w:sz w:val="22"/>
-          <w:szCs w:val="22"/>
-        </w:rPr>
-        <w:t xml:space="preserve"> or </w:t>
-      </w:r>
-      <w:r>
-        <w:rPr>
-          <w:rFonts w:ascii="Times New Roman" w:hAnsi="Times New Roman" w:cs="Times New Roman"/>
-          <w:color w:val="000000" w:themeColor="text1"/>
-          <w:sz w:val="22"/>
-          <w:szCs w:val="22"/>
-        </w:rPr>
-        <w:t>provenance</w:t>
-      </w:r>
-      <w:r>
-        <w:rPr>
-          <w:rFonts w:ascii="Times New Roman" w:hAnsi="Times New Roman" w:cs="Times New Roman"/>
-          <w:color w:val="000000" w:themeColor="text1"/>
-          <w:sz w:val="22"/>
-          <w:szCs w:val="22"/>
-        </w:rPr>
-        <w:t xml:space="preserve"> research. </w:t>
-      </w:r>
-      <w:r>
-        <w:rPr>
-          <w:rFonts w:ascii="Times New Roman" w:hAnsi="Times New Roman" w:cs="Times New Roman"/>
-          <w:color w:val="000000" w:themeColor="text1"/>
-          <w:sz w:val="22"/>
-          <w:szCs w:val="22"/>
-        </w:rPr>
-        <w:t>We believe that this research focus is well suited for the stated scope of Ecological Applications</w:t>
-      </w:r>
-      <w:r>
-        <w:rPr>
-          <w:rFonts w:ascii="Times New Roman" w:hAnsi="Times New Roman" w:cs="Times New Roman"/>
-          <w:color w:val="000000" w:themeColor="text1"/>
-          <w:sz w:val="22"/>
-          <w:szCs w:val="22"/>
-        </w:rPr>
-        <w:t xml:space="preserve">. </w:t>
-      </w:r>
-      <w:r>
-        <w:rPr>
-          <w:rFonts w:ascii="Times New Roman" w:hAnsi="Times New Roman" w:cs="Times New Roman"/>
-          <w:color w:val="000000" w:themeColor="text1"/>
-          <w:sz w:val="22"/>
-          <w:szCs w:val="22"/>
+          <w:sz w:val="20"/>
+          <w:szCs w:val="20"/>
+        </w:rPr>
+        <w:t>Our study introduces a novel analytical framework that expands microchemical tools traditionally applied in freshwater systems to address marine-based hypotheses. By doing so, this work advances our understanding of fisheries dynamics in marine systems and demonstrates how these methods can directly inform management and decision-making processes. We illustrate the utility of this approach using a case study focused on Pacific salmon management in western Alaska; however, the methods presented are broadly applicable across systems and to a wide range of studies that rely on chemical signatures to infer movement, provenance, or stock of origin.</w:t>
+      </w:r>
+      <w:r>
+        <w:rPr>
+          <w:sz w:val="20"/>
+          <w:szCs w:val="20"/>
         </w:rPr>
         <w:t xml:space="preserve"> </w:t>
       </w:r>
-    </w:p>
-    <w:p>
-      <w:pPr>
-        <w:spacing w:line="240" w:lineRule="auto"/>
-        <w:rPr>
-          <w:rFonts w:ascii="Times New Roman" w:hAnsi="Times New Roman" w:cs="Times New Roman"/>
-          <w:sz w:val="22"/>
-          <w:szCs w:val="22"/>
-        </w:rPr>
-      </w:pPr>
+      <w:r>
+        <w:rPr>
+          <w:sz w:val="20"/>
+          <w:szCs w:val="20"/>
+        </w:rPr>
+        <w:t xml:space="preserve">Given the management relevance, methodological innovation, and broad applicability of this work, we believe it will be of strong interest to the readership of </w:t>
+      </w:r>
+      <w:r>
+        <w:rPr>
+          <w:rStyle w:val="Emphasis"/>
+          <w:rFonts w:eastAsiaTheme="majorEastAsia"/>
+          <w:sz w:val="20"/>
+          <w:szCs w:val="20"/>
+        </w:rPr>
+        <w:t>ICES Journal of Marine Science</w:t>
+      </w:r>
+      <w:r>
+        <w:rPr>
+          <w:sz w:val="20"/>
+          <w:szCs w:val="20"/>
+        </w:rPr>
+        <w:t>. We appreciate your consideration of our manuscript</w:t>
+      </w:r>
     </w:p>
     <w:p>
       <w:pPr>
@@ -1441,6 +1355,30 @@
       <w:u w:val="single"/>
     </w:rPr>
   </w:style>
+  <w:style w:type="paragraph" w:customStyle="1" w:styleId="isselectedend">
+    <w:name w:val="isselectedend"/>
+    <w:basedOn w:val="Normal"/>
+    <w:rsid w:val="00F05956"/>
+    <w:pPr>
+      <w:spacing w:before="100" w:beforeAutospacing="1" w:after="100" w:afterAutospacing="1" w:line="240" w:lineRule="auto"/>
+    </w:pPr>
+    <w:rPr>
+      <w:rFonts w:ascii="Times New Roman" w:eastAsia="Times New Roman" w:hAnsi="Times New Roman" w:cs="Times New Roman"/>
+      <w:kern w:val="0"/>
+      <w14:ligatures w14:val="none"/>
+    </w:rPr>
+  </w:style>
+  <w:style w:type="character" w:styleId="Emphasis">
+    <w:name w:val="Emphasis"/>
+    <w:basedOn w:val="DefaultParagraphFont"/>
+    <w:uiPriority w:val="20"/>
+    <w:qFormat/>
+    <w:rsid w:val="00F05956"/>
+    <w:rPr>
+      <w:i/>
+      <w:iCs/>
+    </w:rPr>
+  </w:style>
 </w:styles>
 </file>
 

</xml_diff>